<commit_message>
Completar secciones pendientes de las actividades de la segunda jornada
Herramienta de Gestion Efectiva del Tiempo:
- Seccion 8: registro de 5 dias laborales (31 ago - 4 sep 2026) y analisis
- Seccion 9: matriz de prioridades y cuadrantes
- Seccion 10: ladrones de tiempo identificados
- Seccion 11: patrones de comportamiento
- Seccion 12: brecha de efectividad
- Seccion 13: plan de accion con fechas
- Seccion 14: reflexiones a las 12 preguntas poderosas
- Seccion 15: reflexion final, compromiso a 30 dias e indicadores

Diagnostico de Creencias Limitantes:
- Seccion 4: manifestacion en el trabajo de las 5 creencias priorizadas
- Seccion 7: respuesta sobre el nivel de compromiso
</commit_message>
<xml_diff>
--- a/3. Diagnostico Creencias Limitantes.docx
+++ b/3. Diagnostico Creencias Limitantes.docx
@@ -4017,7 +4017,15 @@
             <w:tcW w:w="3400" w:type="dxa"/>
             <w:vAlign w:val="center"/>
           </w:tcPr>
-          <w:p/>
+          <w:p>
+            <w:r>
+              <w:rPr>
+                <w:sz w:val="20"/>
+                <w:szCs w:val="24"/>
+              </w:rPr>
+              <w:t xml:space="preserve">Asumo tareas que no corresponden a mi rol y evito pedir ayuda para que no se cuestione mi capacidad. En el levantamiento de MP8 y MP21 intento dominar todo el detalle antes de exponer ante jefaturas o dueños de proceso.</w:t>
+            </w:r>
+          </w:p>
         </w:tc>
       </w:tr>
       <w:tr>
@@ -4051,7 +4059,15 @@
             <w:tcW w:w="3400" w:type="dxa"/>
             <w:vAlign w:val="center"/>
           </w:tcPr>
-          <w:p/>
+          <w:p>
+            <w:r>
+              <w:rPr>
+                <w:sz w:val="20"/>
+                <w:szCs w:val="24"/>
+              </w:rPr>
+              <w:t xml:space="preserve">Postergo decisiones y valido en exceso con terceros antes de proponer una solución, especialmente frente a jefaturas y dueños de proceso con más años en la organización.</w:t>
+            </w:r>
+          </w:p>
         </w:tc>
       </w:tr>
       <w:tr>
@@ -4085,7 +4101,15 @@
             <w:tcW w:w="3400" w:type="dxa"/>
             <w:vAlign w:val="center"/>
           </w:tcPr>
-          <w:p/>
+          <w:p>
+            <w:r>
+              <w:rPr>
+                <w:sz w:val="20"/>
+                <w:szCs w:val="24"/>
+              </w:rPr>
+              <w:t xml:space="preserve">Reviso personalmente cada detalle de los documentos y me cuesta cerrar entregables, porque temo que un error puntual anule la percepción de todo el trabajo.</w:t>
+            </w:r>
+          </w:p>
         </w:tc>
       </w:tr>
       <w:tr>
@@ -4119,7 +4143,15 @@
             <w:tcW w:w="3400" w:type="dxa"/>
             <w:vAlign w:val="center"/>
           </w:tcPr>
-          <w:p/>
+          <w:p>
+            <w:r>
+              <w:rPr>
+                <w:sz w:val="20"/>
+                <w:szCs w:val="24"/>
+              </w:rPr>
+              <w:t xml:space="preserve">Me cuesta delegar y, cuando delego, superviso el detalle de lo entregado. El resultado es que la carga se concentra en mí y se vuelve incompatible con las prioridades de mi rol.</w:t>
+            </w:r>
+          </w:p>
         </w:tc>
       </w:tr>
       <w:tr>
@@ -4153,7 +4185,15 @@
             <w:tcW w:w="3400" w:type="dxa"/>
             <w:vAlign w:val="center"/>
           </w:tcPr>
-          <w:p/>
+          <w:p>
+            <w:r>
+              <w:rPr>
+                <w:sz w:val="20"/>
+                <w:szCs w:val="24"/>
+              </w:rPr>
+              <w:t xml:space="preserve">Evito ofrecerme para tareas de mayor visibilidad y asumo que primero debo prepararme más, lo que me lleva a sobrepreparar en lugar de participar.</w:t>
+            </w:r>
+          </w:p>
         </w:tc>
       </w:tr>
     </w:tbl>
@@ -5283,7 +5323,7 @@
         <w:rPr>
           <w:lang w:val="es-CL"/>
         </w:rPr>
-        <w:t>________________________________________________________________________________</w:t>
+        <w:t xml:space="preserve">No aplica: mi nivel de compromiso es 9/10. Para llegar a 10 necesitaría acordar previamente con mi jefatura qué solicitudes puedo derivar, de modo que pedir ayuda no dependa solo de mi voluntad, sino también de un acuerdo formal sobre el alcance de mi rol.</w:t>
       </w:r>
     </w:p>
     <w:p>

</xml_diff>